<commit_message>
docs: regenerate spatial registration report with inline project integration
Agent-Logs-Url: https://github.com/leng-peng/new-jet/sessions/7b24c6ac-5665-4cad-a330-7c68faf2e689

Co-authored-by: leng-peng <252009236+leng-peng@users.noreply.github.com>
</commit_message>
<xml_diff>
--- a/空间配准_空海项目报告版.docx
+++ b/空间配准_空海项目报告版.docx
@@ -9,15 +9,9 @@
           <w:kern w:val="0"/>
         </w:rPr>
       </w:pPr>
-      <w:bookmarkStart w:id="0" w:name="_Toc200290779"/>
-      <w:r>
-        <w:rPr>
-          <w:rFonts w:hint="eastAsia"/>
-          <w:kern w:val="0"/>
-        </w:rPr>
-        <w:t>空间配准原理</w:t>
-      </w:r>
-      <w:bookmarkEnd w:id="0"/>
+      <w:r>
+        <w:t>空间配准原理（面向空海平台多节点相参探测项目）</w:t>
+      </w:r>
     </w:p>
     <w:p>
       <w:pPr>
@@ -26,19 +20,9 @@
           <w:kern w:val="0"/>
         </w:rPr>
       </w:pPr>
-      <w:bookmarkStart w:id="1" w:name="_Toc193727229"/>
-      <w:bookmarkStart w:id="2" w:name="_Toc193727010"/>
-      <w:bookmarkStart w:id="3" w:name="_Toc200290780"/>
-      <w:r>
-        <w:rPr>
-          <w:rFonts w:hint="eastAsia"/>
-          <w:kern w:val="0"/>
-        </w:rPr>
-        <w:t>距离维度空间配准原理</w:t>
-      </w:r>
-      <w:bookmarkEnd w:id="1"/>
-      <w:bookmarkEnd w:id="2"/>
-      <w:bookmarkEnd w:id="3"/>
+      <w:r>
+        <w:t>距离维度空间配准原理（空海协同场景）</w:t>
+      </w:r>
     </w:p>
     <w:p>
       <w:pPr>
@@ -48,37 +32,7 @@
         </w:rPr>
       </w:pPr>
       <w:r>
-        <w:rPr>
-          <w:rFonts w:hint="eastAsia"/>
-          <w:kern w:val="0"/>
-        </w:rPr>
-        <w:t>考虑三站的分布式雷达系统的工作场景，以雷达A、</w:t>
-      </w:r>
-      <w:r>
-        <w:rPr>
-          <w:kern w:val="0"/>
-        </w:rPr>
-        <w:t>B</w:t>
-      </w:r>
-      <w:r>
-        <w:rPr>
-          <w:rFonts w:hint="eastAsia"/>
-          <w:kern w:val="0"/>
-        </w:rPr>
-        <w:t>、</w:t>
-      </w:r>
-      <w:r>
-        <w:rPr>
-          <w:kern w:val="0"/>
-        </w:rPr>
-        <w:t>C</w:t>
-      </w:r>
-      <w:r>
-        <w:rPr>
-          <w:rFonts w:hint="eastAsia"/>
-          <w:kern w:val="0"/>
-        </w:rPr>
-        <w:t>为例，假设空间中存在两个目标1，2。下面阐述目标与站点间的距离之间的关系。</w:t>
+        <w:t>考虑三站的分布式雷达系统的工作场景，以雷达A、B、C为例，假设空间中存在两个目标1，2。下面阐述目标与站点间的距离之间的关系。 在本项目中，该三站模型可映射为空海平台中的任意三节点组合；当扩展到“海面双节点+空中三节点”时，判决关系保持一致，仅路径数量与组合规模增大。</w:t>
       </w:r>
     </w:p>
     <w:p>
@@ -985,65 +939,7 @@
         </w:rPr>
       </w:pPr>
       <w:r>
-        <w:rPr>
-          <w:rFonts w:hint="eastAsia"/>
-          <w:kern w:val="0"/>
-        </w:rPr>
-        <w:t>即</w:t>
-      </w:r>
-      <w:r>
-        <w:rPr>
-          <w:rFonts w:hint="eastAsia"/>
-          <w:kern w:val="0"/>
-        </w:rPr>
-        <w:t>A</w:t>
-      </w:r>
-      <w:r>
-        <w:rPr>
-          <w:rFonts w:hint="eastAsia"/>
-          <w:kern w:val="0"/>
-        </w:rPr>
-        <w:t>与</w:t>
-      </w:r>
-      <w:r>
-        <w:rPr>
-          <w:rFonts w:hint="eastAsia"/>
-          <w:kern w:val="0"/>
-        </w:rPr>
-        <w:t>B</w:t>
-      </w:r>
-      <w:r>
-        <w:rPr>
-          <w:rFonts w:hint="eastAsia"/>
-          <w:kern w:val="0"/>
-        </w:rPr>
-        <w:t>之间真实目标的路径中，它路径传播时延相等，自路径传播时延之和与它路径传播时延之和相等。同理，</w:t>
-      </w:r>
-      <w:r>
-        <w:rPr>
-          <w:kern w:val="0"/>
-        </w:rPr>
-        <w:t>AC</w:t>
-      </w:r>
-      <w:r>
-        <w:rPr>
-          <w:rFonts w:hint="eastAsia"/>
-          <w:kern w:val="0"/>
-        </w:rPr>
-        <w:t>、</w:t>
-      </w:r>
-      <w:r>
-        <w:rPr>
-          <w:kern w:val="0"/>
-        </w:rPr>
-        <w:t>BC</w:t>
-      </w:r>
-      <w:r>
-        <w:rPr>
-          <w:rFonts w:hint="eastAsia"/>
-          <w:kern w:val="0"/>
-        </w:rPr>
-        <w:t>之间的路径也是满足这种关系的。而随机产生的噪声通常不满足这样的关系。据此可以对各路径数据中，满足关系进行配准，而不满足关系的进行排除，找到同一目标在不同路径中的数据，实现空间配准。这种从空间中目标与雷达站点的距离关系入手，得到的配准原理，本文称其为距离维度空间配准原理。</w:t>
+        <w:t>即A与B之间真实目标的路径中，它路径传播时延相等，自路径传播时延之和与它路径传播时延之和相等。同理，AC、BC之间的路径也是满足这种关系的。而随机产生的噪声通常不满足这样的关系。据此可以对各路径数据中，满足关系进行配准，而不满足关系的进行排除，找到同一目标在不同路径中的数据，实现空间配准。这种从空间中目标与雷达站点的距离关系入手，得到的配准原理，本文称其为距离维度空间配准原理。 对本项目而言，这一原理直接服务于多节点检测后的同源目标关联，是后续定位与跟踪稳定性的基础。</w:t>
       </w:r>
     </w:p>
     <w:p>
@@ -1208,43 +1104,7 @@
         </w:rPr>
       </w:pPr>
       <w:r>
-        <w:rPr>
-          <w:rFonts w:hint="eastAsia"/>
-          <w:kern w:val="0"/>
-        </w:rPr>
-        <w:t>由于在信号传播和处理中存在各种非理想因素，各路径检测到的信号传播时延并不等于真实值，并且信号接收端进行M</w:t>
-      </w:r>
-      <w:r>
-        <w:rPr>
-          <w:kern w:val="0"/>
-        </w:rPr>
-        <w:t>TD</w:t>
-      </w:r>
-      <w:r>
-        <w:rPr>
-          <w:rFonts w:hint="eastAsia"/>
-          <w:kern w:val="0"/>
-        </w:rPr>
-        <w:t>等经典处理后，目标相应的信号传播时间会转化为对应的距离单元，因此有一个量化误差。综合考虑，应该对公式等号保留一定的门限值</w:t>
-      </w:r>
-      <w:r>
-        <w:rPr>
-          <w:kern w:val="0"/>
-          <w:position w:val="-6"/>
-        </w:rPr>
-        <w:object w:dxaOrig="200" w:dyaOrig="213" w14:anchorId="0D83A04D">
-          <v:shape id="_x0000_i1045" type="#_x0000_t75" style="width:8.75pt;height:10.8pt" o:ole="">
-            <v:imagedata r:id="rId45" o:title=""/>
-          </v:shape>
-          <o:OLEObject Type="Embed" ProgID="Equation.DSMT4" ShapeID="_x0000_i1045" DrawAspect="Content" ObjectID="_1840112606" r:id="rId46"/>
-        </w:object>
-      </w:r>
-      <w:r>
-        <w:rPr>
-          <w:rFonts w:hint="eastAsia"/>
-          <w:kern w:val="0"/>
-        </w:rPr>
-        <w:t>，则有</w:t>
+        <w:t>由于在信号传播和处理中存在各种非理想因素，各路径检测到的信号传播时延并不等于真实值，并且信号接收端进行MTD等经典处理后，目标相应的信号传播时间会转化为对应的距离单元，因此有一个量化误差。综合考虑，应该对公式等号保留一定的门限值，则有 在空海异构平台条件下，误差还叠加了平台姿态扰动、链路同步残差与海杂波影响，因此门限设置需兼顾理论精度与工程鲁棒性。</w:t>
       </w:r>
     </w:p>
     <w:p>
@@ -2248,19 +2108,9 @@
           <w:kern w:val="0"/>
         </w:rPr>
       </w:pPr>
-      <w:bookmarkStart w:id="7" w:name="_Toc193727011"/>
-      <w:bookmarkStart w:id="8" w:name="_Toc193727230"/>
-      <w:bookmarkStart w:id="9" w:name="_Toc200290781"/>
-      <w:r>
-        <w:rPr>
-          <w:rFonts w:hint="eastAsia"/>
-          <w:kern w:val="0"/>
-        </w:rPr>
-        <w:t>多普勒维度空间配准原理</w:t>
-      </w:r>
-      <w:bookmarkEnd w:id="7"/>
-      <w:bookmarkEnd w:id="8"/>
-      <w:bookmarkEnd w:id="9"/>
+      <w:r>
+        <w:t>多普勒维度空间配准原理（空海协同场景）</w:t>
+      </w:r>
     </w:p>
     <w:p>
       <w:pPr>
@@ -3394,121 +3244,7 @@
         </w:rPr>
       </w:pPr>
       <w:r>
-        <w:rPr>
-          <w:rFonts w:hint="eastAsia"/>
-          <w:kern w:val="0"/>
-        </w:rPr>
-        <w:t>与距离维类似，由于在信号传播和处理中存在各种非理想因素，各路径检测到的信号多普勒频移并不等于真实多普勒频移，并且信号接收端进行M</w:t>
-      </w:r>
-      <w:r>
-        <w:rPr>
-          <w:kern w:val="0"/>
-        </w:rPr>
-        <w:t>TD</w:t>
-      </w:r>
-      <w:r>
-        <w:rPr>
-          <w:rFonts w:hint="eastAsia"/>
-          <w:kern w:val="0"/>
-        </w:rPr>
-        <w:t>等经典处理后，目标相应的多普勒频移会转化为对应的多普勒通道，因此有一个量化误差。综合考虑，应该对公式</w:t>
-      </w:r>
-      <w:r>
-        <w:rPr>
-          <w:iCs/>
-          <w:kern w:val="0"/>
-        </w:rPr>
-        <w:fldChar w:fldCharType="begin" w:fldLock="1"/>
-      </w:r>
-      <w:r>
-        <w:rPr>
-          <w:iCs/>
-          <w:kern w:val="0"/>
-        </w:rPr>
-        <w:instrText xml:space="preserve"> </w:instrText>
-      </w:r>
-      <w:r>
-        <w:rPr>
-          <w:rFonts w:hint="eastAsia"/>
-          <w:iCs/>
-          <w:kern w:val="0"/>
-        </w:rPr>
-        <w:instrText>GOTOBUTTON ZEqnNum386724  \* MERGEFORMAT</w:instrText>
-      </w:r>
-      <w:r>
-        <w:rPr>
-          <w:iCs/>
-          <w:kern w:val="0"/>
-        </w:rPr>
-        <w:instrText xml:space="preserve"> </w:instrText>
-      </w:r>
-      <w:r>
-        <w:rPr>
-          <w:iCs/>
-          <w:kern w:val="0"/>
-        </w:rPr>
-        <w:fldChar w:fldCharType="begin" w:fldLock="1"/>
-      </w:r>
-      <w:r>
-        <w:rPr>
-          <w:iCs/>
-          <w:kern w:val="0"/>
-        </w:rPr>
-        <w:instrText xml:space="preserve"> REF ZEqnNum386724 \* Charformat \! \* MERGEFORMAT </w:instrText>
-      </w:r>
-      <w:r>
-        <w:rPr>
-          <w:iCs/>
-          <w:kern w:val="0"/>
-        </w:rPr>
-        <w:fldChar w:fldCharType="separate"/>
-      </w:r>
-      <w:r>
-        <w:rPr>
-          <w:iCs/>
-          <w:kern w:val="0"/>
-        </w:rPr>
-        <w:instrText>(4-10)</w:instrText>
-      </w:r>
-      <w:r>
-        <w:rPr>
-          <w:iCs/>
-          <w:kern w:val="0"/>
-        </w:rPr>
-        <w:fldChar w:fldCharType="end"/>
-      </w:r>
-      <w:r>
-        <w:rPr>
-          <w:iCs/>
-          <w:kern w:val="0"/>
-        </w:rPr>
-        <w:fldChar w:fldCharType="end"/>
-      </w:r>
-      <w:r>
-        <w:rPr>
-          <w:rFonts w:hint="eastAsia"/>
-          <w:kern w:val="0"/>
-        </w:rPr>
-        <w:t>等号保留一定的门限值</w:t>
-      </w:r>
-      <w:r>
-        <w:rPr>
-          <w:kern w:val="0"/>
-          <w:position w:val="-6"/>
-        </w:rPr>
-        <w:object w:dxaOrig="200" w:dyaOrig="213" w14:anchorId="14A2BB03">
-          <v:shape id="_x0000_i1072" type="#_x0000_t75" style="width:8.75pt;height:10.8pt" o:ole="">
-            <v:imagedata r:id="rId45" o:title=""/>
-          </v:shape>
-          <o:OLEObject Type="Embed" ProgID="Equation.DSMT4" ShapeID="_x0000_i1072" DrawAspect="Content" ObjectID="_1840112633" r:id="rId95"/>
-        </w:object>
-      </w:r>
-      <w:r>
-        <w:rPr>
-          <w:rFonts w:hint="eastAsia"/>
-          <w:kern w:val="0"/>
-        </w:rPr>
-        <w:t>，则有</w:t>
+        <w:t>与距离维类似，由于在信号传播和处理中存在各种非理想因素，各路径检测到的信号多普勒频移并不等于真实多普勒频移，并且信号接收端进行MTD等经典处理后，目标相应的多普勒频移会转化为对应的多普勒通道，因此有一个量化误差。综合考虑，应该对公式等号保留一定的门限值，则有 在空海异构平台条件下，误差还叠加了平台姿态扰动、链路同步残差与海杂波影响，因此门限设置需兼顾理论精度与工程鲁棒性。</w:t>
       </w:r>
     </w:p>
     <w:p>
@@ -3834,408 +3570,69 @@
         </w:rPr>
       </w:pPr>
       <w:r>
-        <w:rPr>
-          <w:rFonts w:hint="eastAsia"/>
-          <w:kern w:val="0"/>
-        </w:rPr>
-        <w:t>在分布式雷达检测中，目标的多普勒一般由M</w:t>
-      </w:r>
-      <w:r>
-        <w:rPr>
-          <w:kern w:val="0"/>
-        </w:rPr>
-        <w:t>TD</w:t>
-      </w:r>
-      <w:r>
-        <w:rPr>
-          <w:rFonts w:hint="eastAsia"/>
-          <w:kern w:val="0"/>
-        </w:rPr>
-        <w:t>后数据</w:t>
-      </w:r>
-      <w:proofErr w:type="gramStart"/>
-      <w:r>
-        <w:rPr>
-          <w:rFonts w:hint="eastAsia"/>
-          <w:kern w:val="0"/>
-        </w:rPr>
-        <w:t>慢时间维所</w:t>
-      </w:r>
-      <w:proofErr w:type="gramEnd"/>
-      <w:r>
-        <w:rPr>
-          <w:rFonts w:hint="eastAsia"/>
-          <w:kern w:val="0"/>
-        </w:rPr>
-        <w:t>对应的多普勒通道表示，多普勒谱是对</w:t>
-      </w:r>
-      <w:proofErr w:type="gramStart"/>
-      <w:r>
-        <w:rPr>
-          <w:rFonts w:hint="eastAsia"/>
-          <w:kern w:val="0"/>
-        </w:rPr>
-        <w:t>慢时间</w:t>
-      </w:r>
-      <w:proofErr w:type="gramEnd"/>
-      <w:r>
-        <w:rPr>
-          <w:rFonts w:hint="eastAsia"/>
-          <w:kern w:val="0"/>
-        </w:rPr>
-        <w:t>数据做</w:t>
-      </w:r>
-      <w:r>
-        <w:rPr>
-          <w:rFonts w:hint="eastAsia"/>
-          <w:kern w:val="0"/>
-        </w:rPr>
-        <w:t>离散时间傅里叶变换</w:t>
-      </w:r>
-      <w:r>
-        <w:rPr>
-          <w:rFonts w:hint="eastAsia"/>
-          <w:kern w:val="0"/>
-        </w:rPr>
-        <w:t>产生的。而</w:t>
-      </w:r>
-      <w:proofErr w:type="gramStart"/>
-      <w:r>
-        <w:rPr>
-          <w:rFonts w:hint="eastAsia"/>
-          <w:kern w:val="0"/>
-        </w:rPr>
-        <w:t>慢时间</w:t>
-      </w:r>
-      <w:proofErr w:type="gramEnd"/>
-      <w:r>
-        <w:rPr>
-          <w:rFonts w:hint="eastAsia"/>
-          <w:kern w:val="0"/>
-        </w:rPr>
-        <w:t>维度数据的间隔为</w:t>
-      </w:r>
-      <w:r>
+        <w:t>在分布式雷达检测中，目标的多普勒一般由MTD后数据慢时间维所对应的多普勒通道表示，多普勒谱是对慢时间数据做离散时间傅里叶变换产生的。而慢时间维度数据的间隔为，脉冲数量为，则多普勒分辨率大约为[63]。考虑到目标多普勒测量时会量化为最近的多普勒通道，其多普勒门限应考虑设置为。 对本项目空海联合场景，建议将平台运动补偿残差纳入门限设计，以减少机动条件下的误配与漏配。</w:t>
+      </w:r>
+    </w:p>
+    <w:p>
+      <w:pPr>
+        <w:pStyle w:val="2"/>
+        <w:rPr>
+          <w:kern w:val="0"/>
+        </w:rPr>
+      </w:pPr>
+      <w:r>
+        <w:t>距离-多普勒二维配准算法（项目化实现）</w:t>
+      </w:r>
+    </w:p>
+    <w:p>
+      <w:pPr>
+        <w:ind w:right="240" w:firstLine="480"/>
         <w:rPr>
           <w:rFonts w:cs="Times New Roman"/>
           <w:kern w:val="0"/>
-          <w:position w:val="-12"/>
-        </w:rPr>
-        <w:object w:dxaOrig="238" w:dyaOrig="363" w14:anchorId="6CA85DAC">
-          <v:shape id="_x0000_i1075" type="#_x0000_t75" style="width:11.65pt;height:18.3pt" o:ole="">
-            <v:imagedata r:id="rId100" o:title=""/>
-          </v:shape>
-          <o:OLEObject Type="Embed" ProgID="Equation.DSMT4" ShapeID="_x0000_i1075" DrawAspect="Content" ObjectID="_1840112636" r:id="rId101"/>
-        </w:object>
-      </w:r>
+        </w:rPr>
+      </w:pPr>
+      <w:r>
+        <w:t>基于上一节的空间配准原理，它路径传播时延相等，自路径传播时延之和与对应它路径传播时延之和相等；它路径多普勒频移相等，自路径多普勒频移之和与对应它路径多普勒频移之和相等，这四个判断条件本文简称为距离-多普勒二维配准条件。同一目标在分布式雷达中的数据会满足这样的配准条件，而不同目标的数据不能满足。据此本文从距离-多普勒两个维度，对各雷达路径中的检测信息进行配准，找到匹配的同一目标并排除虚假目标的方法。由于依赖距离和多普勒数据，因此雷达系统中距离和多普勒分辨率越高，算法分辨率也越高，分辨不同目标的能力越强。 在本项目处理链路中，该步骤位于“相参合成后检测”与“节点间融合前关联”之间，承担跨平台同一目标的关键筛选任务。</w:t>
+      </w:r>
+    </w:p>
+    <w:p>
+      <w:pPr>
+        <w:pStyle w:val="3"/>
+        <w:rPr>
+          <w:kern w:val="0"/>
+        </w:rPr>
+      </w:pPr>
+      <w:r>
+        <w:t>二维配准算法流程（工程实现）</w:t>
+      </w:r>
+    </w:p>
+    <w:p>
+      <w:pPr>
+        <w:ind w:right="240" w:firstLine="480"/>
+        <w:rPr>
+          <w:rFonts w:cs="Times New Roman"/>
+          <w:kern w:val="0"/>
+        </w:rPr>
+      </w:pPr>
       <w:r>
         <w:rPr>
           <w:rFonts w:cs="Times New Roman" w:hint="eastAsia"/>
           <w:kern w:val="0"/>
         </w:rPr>
-        <w:t>，脉冲数量为</w:t>
-      </w:r>
-      <w:r>
+        <w:t>为了将找出各路径距离-多普勒信息中满足二维配准条件的数据，并进行关联配准，本文以分布式三个雷达检测目标为例，给出</w:t>
+      </w:r>
+    </w:p>
+    <w:p>
+      <w:pPr>
+        <w:ind w:right="240" w:firstLine="480"/>
         <w:rPr>
           <w:rFonts w:cs="Times New Roman"/>
           <w:kern w:val="0"/>
-          <w:position w:val="-4"/>
-        </w:rPr>
-        <w:object w:dxaOrig="326" w:dyaOrig="263" w14:anchorId="121E79F6">
-          <v:shape id="_x0000_i1076" type="#_x0000_t75" style="width:17.05pt;height:12.9pt" o:ole="">
-            <v:imagedata r:id="rId102" o:title=""/>
-          </v:shape>
-          <o:OLEObject Type="Embed" ProgID="Equation.DSMT4" ShapeID="_x0000_i1076" DrawAspect="Content" ObjectID="_1840112637" r:id="rId103"/>
-        </w:object>
-      </w:r>
-      <w:r>
-        <w:rPr>
-          <w:rFonts w:cs="Times New Roman" w:hint="eastAsia"/>
-          <w:kern w:val="0"/>
-        </w:rPr>
-        <w:t>，则</w:t>
-      </w:r>
-      <w:r>
-        <w:rPr>
-          <w:rFonts w:hint="eastAsia"/>
-          <w:kern w:val="0"/>
-        </w:rPr>
-        <w:t>多普勒分辨率大约为</w:t>
-      </w:r>
-      <w:r>
-        <w:rPr>
-          <w:kern w:val="0"/>
-          <w:position w:val="-12"/>
-        </w:rPr>
-        <w:object w:dxaOrig="1240" w:dyaOrig="363" w14:anchorId="36398A31">
-          <v:shape id="_x0000_i1077" type="#_x0000_t75" style="width:63.25pt;height:18.3pt" o:ole="">
-            <v:imagedata r:id="rId104" o:title=""/>
-          </v:shape>
-          <o:OLEObject Type="Embed" ProgID="Equation.DSMT4" ShapeID="_x0000_i1077" DrawAspect="Content" ObjectID="_1840112638" r:id="rId105"/>
-        </w:object>
-      </w:r>
-      <w:r>
-        <w:rPr>
-          <w:kern w:val="0"/>
-          <w:vertAlign w:val="superscript"/>
-        </w:rPr>
-        <w:fldChar w:fldCharType="begin" w:fldLock="1"/>
-      </w:r>
-      <w:r>
-        <w:rPr>
-          <w:kern w:val="0"/>
-          <w:vertAlign w:val="superscript"/>
-        </w:rPr>
-        <w:instrText xml:space="preserve"> REF _Ref195004631 \r \h  \* MERGEFORMAT </w:instrText>
-      </w:r>
-      <w:r>
-        <w:rPr>
-          <w:kern w:val="0"/>
-          <w:vertAlign w:val="superscript"/>
-        </w:rPr>
-      </w:r>
-      <w:r>
-        <w:rPr>
-          <w:kern w:val="0"/>
-          <w:vertAlign w:val="superscript"/>
-        </w:rPr>
-        <w:fldChar w:fldCharType="separate"/>
-      </w:r>
-      <w:r>
-        <w:rPr>
-          <w:kern w:val="0"/>
-          <w:vertAlign w:val="superscript"/>
-        </w:rPr>
-        <w:t>[63]</w:t>
-      </w:r>
-      <w:r>
-        <w:rPr>
-          <w:kern w:val="0"/>
-          <w:vertAlign w:val="superscript"/>
-        </w:rPr>
-        <w:fldChar w:fldCharType="end"/>
-      </w:r>
-      <w:r>
-        <w:rPr>
-          <w:rFonts w:cs="Times New Roman" w:hint="eastAsia"/>
-          <w:kern w:val="0"/>
-        </w:rPr>
-        <w:t>。考虑到目标多普勒测量时会量化为最近的多普勒通道，其多普勒门限应考虑设置为</w:t>
-      </w:r>
-      <w:r>
-        <w:rPr>
-          <w:rFonts w:cs="Times New Roman"/>
-          <w:kern w:val="0"/>
-          <w:position w:val="-14"/>
-        </w:rPr>
-        <w:object w:dxaOrig="1039" w:dyaOrig="376" w14:anchorId="587739A3">
-          <v:shape id="_x0000_i1078" type="#_x0000_t75" style="width:51.6pt;height:19.15pt" o:ole="">
-            <v:imagedata r:id="rId106" o:title=""/>
-          </v:shape>
-          <o:OLEObject Type="Embed" ProgID="Equation.DSMT4" ShapeID="_x0000_i1078" DrawAspect="Content" ObjectID="_1840112639" r:id="rId107"/>
-        </w:object>
-      </w:r>
-      <w:r>
-        <w:rPr>
-          <w:rFonts w:cs="Times New Roman" w:hint="eastAsia"/>
-          <w:kern w:val="0"/>
-        </w:rPr>
-        <w:t>。</w:t>
-      </w:r>
-    </w:p>
-    <w:p>
-      <w:pPr>
-        <w:pStyle w:val="2"/>
-        <w:rPr>
-          <w:kern w:val="0"/>
-        </w:rPr>
-      </w:pPr>
-      <w:bookmarkStart w:id="14" w:name="_Toc193727012"/>
-      <w:bookmarkStart w:id="15" w:name="_Toc193727231"/>
-      <w:bookmarkStart w:id="16" w:name="_Toc200290782"/>
-      <w:r>
-        <w:rPr>
-          <w:rFonts w:hint="eastAsia"/>
-          <w:kern w:val="0"/>
-        </w:rPr>
-        <w:t>距离-多普勒二维配准算法</w:t>
-      </w:r>
-      <w:bookmarkEnd w:id="14"/>
-      <w:bookmarkEnd w:id="15"/>
-      <w:bookmarkEnd w:id="16"/>
-    </w:p>
-    <w:p>
-      <w:pPr>
-        <w:ind w:right="240" w:firstLine="480"/>
-        <w:rPr>
-          <w:rFonts w:cs="Times New Roman"/>
-          <w:kern w:val="0"/>
-        </w:rPr>
-      </w:pPr>
-      <w:r>
-        <w:rPr>
-          <w:rFonts w:cs="Times New Roman" w:hint="eastAsia"/>
-          <w:kern w:val="0"/>
-        </w:rPr>
-        <w:t>基于上一节的空间配准原理，</w:t>
-      </w:r>
-      <w:r>
-        <w:rPr>
-          <w:rFonts w:hint="eastAsia"/>
-          <w:kern w:val="0"/>
-        </w:rPr>
-        <w:t>它路径传播时延相等，自路径传播时延之和与对</w:t>
-      </w:r>
-      <w:r>
-        <w:rPr>
-          <w:rFonts w:hint="eastAsia"/>
-          <w:kern w:val="0"/>
-        </w:rPr>
-        <w:lastRenderedPageBreak/>
-        <w:t>应它路径传播时延之和相等；它路径多普勒频移相等，自路径多普勒频移之和与对应它路径多普勒频移之和相等，这四个判断条件本文简称为</w:t>
-      </w:r>
-      <w:r>
-        <w:rPr>
-          <w:rFonts w:cs="Times New Roman" w:hint="eastAsia"/>
-          <w:kern w:val="0"/>
-        </w:rPr>
-        <w:t>距离-多普勒二维配准条件</w:t>
-      </w:r>
-      <w:r>
-        <w:rPr>
-          <w:rFonts w:hint="eastAsia"/>
-          <w:kern w:val="0"/>
-        </w:rPr>
-        <w:t>。</w:t>
-      </w:r>
-      <w:r>
-        <w:rPr>
-          <w:rFonts w:hint="eastAsia"/>
-          <w:kern w:val="0"/>
-        </w:rPr>
-        <w:t>同一目标在分布式雷达中的数据会满足这样的配准条件，而不同目标的数据不能满足。</w:t>
-      </w:r>
-      <w:r>
-        <w:rPr>
-          <w:rFonts w:hint="eastAsia"/>
-          <w:kern w:val="0"/>
-        </w:rPr>
-        <w:t>据此</w:t>
-      </w:r>
-      <w:r>
-        <w:rPr>
-          <w:rFonts w:cs="Times New Roman" w:hint="eastAsia"/>
-          <w:kern w:val="0"/>
-        </w:rPr>
-        <w:t>本文从距离-多普勒两个维度，对各雷达路径中的检测信息进行配准，找到匹配的同一目标并排除虚假目标的方法。</w:t>
-      </w:r>
-      <w:r>
-        <w:rPr>
-          <w:rFonts w:cs="Times New Roman" w:hint="eastAsia"/>
-          <w:kern w:val="0"/>
-        </w:rPr>
-        <w:t>由于依赖距离和多普勒数据，因此雷达系统中距离和多普勒分辨率越高，算法分辨率也越高，分辨不同目标的能力越强。</w:t>
-      </w:r>
-    </w:p>
-    <w:p>
-      <w:pPr>
-        <w:pStyle w:val="3"/>
-        <w:rPr>
-          <w:kern w:val="0"/>
-        </w:rPr>
-      </w:pPr>
-      <w:bookmarkStart w:id="17" w:name="_Toc193727013"/>
-      <w:bookmarkStart w:id="18" w:name="_Toc193727232"/>
-      <w:bookmarkStart w:id="19" w:name="_Toc200290783"/>
-      <w:r>
-        <w:rPr>
-          <w:rFonts w:hint="eastAsia"/>
-          <w:kern w:val="0"/>
-        </w:rPr>
-        <w:t>二维配准算法流程</w:t>
-      </w:r>
-      <w:bookmarkEnd w:id="17"/>
-      <w:bookmarkEnd w:id="18"/>
-      <w:bookmarkEnd w:id="19"/>
-    </w:p>
-    <w:p>
-      <w:pPr>
-        <w:ind w:right="240" w:firstLine="480"/>
-        <w:rPr>
-          <w:rFonts w:cs="Times New Roman"/>
-          <w:kern w:val="0"/>
-        </w:rPr>
-      </w:pPr>
-      <w:r>
-        <w:rPr>
-          <w:rFonts w:cs="Times New Roman" w:hint="eastAsia"/>
-          <w:kern w:val="0"/>
-        </w:rPr>
-        <w:t>为了将找出各路径距离-多普勒信息中满足二维配准条件的数据，并进行关联配准，本文以分布式三个雷达检测目标为例，给出</w:t>
-      </w:r>
-    </w:p>
-    <w:p>
-      <w:pPr>
-        <w:ind w:right="240" w:firstLine="480"/>
-        <w:rPr>
-          <w:rFonts w:cs="Times New Roman"/>
-          <w:kern w:val="0"/>
-        </w:rPr>
-      </w:pPr>
-      <w:r>
-        <w:rPr>
-          <w:rFonts w:cs="Times New Roman" w:hint="eastAsia"/>
-          <w:kern w:val="0"/>
-        </w:rPr>
-        <w:t>二维配准算法具体包含以下步骤：1、分布式雷达接收信号和干扰；2、获取不同路径在MTD处理后的数据；3、按照自发自收路径和</w:t>
-      </w:r>
-      <w:proofErr w:type="gramStart"/>
-      <w:r>
-        <w:rPr>
-          <w:rFonts w:cs="Times New Roman" w:hint="eastAsia"/>
-          <w:kern w:val="0"/>
-        </w:rPr>
-        <w:t>自发它</w:t>
-      </w:r>
-      <w:proofErr w:type="gramEnd"/>
-      <w:r>
-        <w:rPr>
-          <w:rFonts w:cs="Times New Roman" w:hint="eastAsia"/>
-          <w:kern w:val="0"/>
-        </w:rPr>
-        <w:t>收路径对数据进行分类；4、排除关联</w:t>
-      </w:r>
-      <w:proofErr w:type="gramStart"/>
-      <w:r>
-        <w:rPr>
-          <w:rFonts w:cs="Times New Roman" w:hint="eastAsia"/>
-          <w:kern w:val="0"/>
-        </w:rPr>
-        <w:t>自发它</w:t>
-      </w:r>
-      <w:proofErr w:type="gramEnd"/>
-      <w:r>
-        <w:rPr>
-          <w:rFonts w:cs="Times New Roman" w:hint="eastAsia"/>
-          <w:kern w:val="0"/>
-        </w:rPr>
-        <w:t>收路径中不满足距离-多普勒二维门限条件的数据；5、判断自发自收路径与其对应</w:t>
-      </w:r>
-      <w:proofErr w:type="gramStart"/>
-      <w:r>
-        <w:rPr>
-          <w:rFonts w:cs="Times New Roman" w:hint="eastAsia"/>
-          <w:kern w:val="0"/>
-        </w:rPr>
-        <w:t>自发它</w:t>
-      </w:r>
-      <w:proofErr w:type="gramEnd"/>
-      <w:r>
-        <w:rPr>
-          <w:rFonts w:cs="Times New Roman" w:hint="eastAsia"/>
-          <w:kern w:val="0"/>
-        </w:rPr>
-        <w:t>收路径的数据是否满足距离-多普勒二维配准条件，如果满足，继续判断其他路径组合是否满足，直到所有路径组合均遍历，进行步骤7。如果不满足，进行步骤6；6、搜索该路径下的下一组数据，进行步骤5；7、将满足二维空间配准门限条件的数据组合保留并输出。</w:t>
+        </w:rPr>
+      </w:pPr>
+      <w:r>
+        <w:t>二维配准算法具体包含以下步骤：1、分布式雷达接收信号和干扰；2、获取不同路径在MTD处理后的数据；3、按照自发自收路径和自发它收路径对数据进行分类；4、排除关联自发它收路径中不满足距离-多普勒二维门限条件的数据；5、判断自发自收路径与其对应自发它收路径的数据是否满足距离-多普勒二维配准条件，如果满足，继续判断其他路径组合是否满足，直到所有路径组合均遍历，进行步骤7。如果不满足，进行步骤6；6、搜索该路径下的下一组数据，进行步骤5；7、将满足二维空间配准门限条件的数据组合保留并输出。 对应本项目工程实现时，可按“节点内处理—路径重组—二维判决—关联输出”的模块化方式部署，便于与现有处理流程对接。</w:t>
       </w:r>
     </w:p>
     <w:p>
@@ -4822,11 +4219,7 @@
         </w:rPr>
       </w:pPr>
       <w:r>
-        <w:rPr>
-          <w:rFonts w:hint="eastAsia"/>
-          <w:kern w:val="0"/>
-        </w:rPr>
-        <w:t>由于真实目标在各路经的数据是满足距离-多普勒二维配准算法的，因此这些数据能够通过算法流程并输出。下面将二维配准算法分解成输入数据整理，关联它路径配准和自路径与它路径配准三个部分，分别详细说明算法各部分的处理方式。</w:t>
+        <w:t>由于真实目标在各路经的数据是满足距离-多普勒二维配准算法的，因此这些数据能够通过算法流程并输出。下面将二维配准算法分解成输入数据整理，关联它路径配准和自路径与它路径配准三个部分，分别详细说明算法各部分的处理方式。 在本项目仿真与半实物验证中，该特性同样成立，可用于区分真实回波与跨节点伪匹配。</w:t>
       </w:r>
     </w:p>
     <w:p>
@@ -4836,19 +4229,9 @@
           <w:kern w:val="0"/>
         </w:rPr>
       </w:pPr>
-      <w:bookmarkStart w:id="21" w:name="_Toc193727014"/>
-      <w:bookmarkStart w:id="22" w:name="_Toc193727233"/>
-      <w:bookmarkStart w:id="23" w:name="_Toc200290784"/>
-      <w:r>
-        <w:rPr>
-          <w:rFonts w:hint="eastAsia"/>
-          <w:kern w:val="0"/>
-        </w:rPr>
-        <w:t>输入数据整理</w:t>
-      </w:r>
-      <w:bookmarkEnd w:id="21"/>
-      <w:bookmarkEnd w:id="22"/>
-      <w:bookmarkEnd w:id="23"/>
+      <w:r>
+        <w:t>输入数据整理（项目数据接口）</w:t>
+      </w:r>
     </w:p>
     <w:p>
       <w:pPr>
@@ -4858,75 +4241,7 @@
         </w:rPr>
       </w:pPr>
       <w:r>
-        <w:rPr>
-          <w:kern w:val="0"/>
-        </w:rPr>
-        <w:t>该部分算法主要是对</w:t>
-      </w:r>
-      <w:r>
-        <w:rPr>
-          <w:rFonts w:hint="eastAsia"/>
-          <w:kern w:val="0"/>
-        </w:rPr>
-        <w:t>二维</w:t>
-      </w:r>
-      <w:r>
-        <w:rPr>
-          <w:kern w:val="0"/>
-        </w:rPr>
-        <w:t>配准</w:t>
-      </w:r>
-      <w:r>
-        <w:rPr>
-          <w:rFonts w:hint="eastAsia"/>
-          <w:kern w:val="0"/>
-        </w:rPr>
-        <w:t>算法</w:t>
-      </w:r>
-      <w:r>
-        <w:rPr>
-          <w:kern w:val="0"/>
-        </w:rPr>
-        <w:t>的输入数据进行初始化和分类，便于后续的逻辑判别。需要初始化的数据包括：雷达</w:t>
-      </w:r>
-      <w:r>
-        <w:rPr>
-          <w:rFonts w:hint="eastAsia"/>
-          <w:kern w:val="0"/>
-        </w:rPr>
-        <w:t>站点</w:t>
-      </w:r>
-      <w:r>
-        <w:rPr>
-          <w:kern w:val="0"/>
-        </w:rPr>
-        <w:t>数目，</w:t>
-      </w:r>
-      <w:r>
-        <w:rPr>
-          <w:rFonts w:hint="eastAsia"/>
-          <w:kern w:val="0"/>
-        </w:rPr>
-        <w:t>积累脉冲</w:t>
-      </w:r>
-      <w:r>
-        <w:rPr>
-          <w:kern w:val="0"/>
-        </w:rPr>
-        <w:t>数目</w:t>
-      </w:r>
-      <w:r>
-        <w:rPr>
-          <w:rFonts w:hint="eastAsia"/>
-          <w:kern w:val="0"/>
-        </w:rPr>
-        <w:t>C</w:t>
-      </w:r>
-      <w:r>
-        <w:rPr>
-          <w:kern w:val="0"/>
-        </w:rPr>
-        <w:t>PI，它路径配准门限，自路径它路径配准门限，多普勒配准门限，路径数量。从输入数据中，还需得到每条路径上目标个数，最大目标个数。根据这些数据，初始化一个目标检测矩阵，该矩阵有三个维度：第一维是路径编号，总数为路径数量；第二维是目标点编号，总数为最大目标个数；第三维是目标数据信息，包括距离、多普勒两条。将该矩阵的第一维看作行，第二维看作列，那么该三维矩阵可以看作是在路径编号-目标点编号的二维矩阵中，存放了距离和多普勒两条信息。</w:t>
+        <w:t>该部分算法主要是对二维配准算法的输入数据进行初始化和分类，便于后续的逻辑判别。需要初始化的数据包括：雷达站点数目，积累脉冲数目CPI，它路径配准门限，自路径它路径配准门限，多普勒配准门限，路径数量。从输入数据中，还需得到每条路径上目标个数，最大目标个数。根据这些数据，初始化一个目标检测矩阵，该矩阵有三个维度：第一维是路径编号，总数为路径数量；第二维是目标点编号，总数为最大目标个数；第三维是目标数据信息，包括距离、多普勒两条。将该矩阵的第一维看作行，第二维看作列，那么该三维矩阵可以看作是在路径编号-目标点编号的二维矩阵中，存放了距离和多普勒两条信息。 面向本项目，输入数据除距离与多普勒外，还可同时携带时间戳质量标记与检测置信度，以提升后续判决稳定性。</w:t>
       </w:r>
     </w:p>
     <w:p>
@@ -5492,19 +4807,9 @@
           <w:kern w:val="0"/>
         </w:rPr>
       </w:pPr>
-      <w:bookmarkStart w:id="25" w:name="_Toc193727234"/>
-      <w:bookmarkStart w:id="26" w:name="_Toc193727015"/>
-      <w:bookmarkStart w:id="27" w:name="_Toc200290785"/>
-      <w:r>
-        <w:rPr>
-          <w:rFonts w:hint="eastAsia"/>
-          <w:kern w:val="0"/>
-        </w:rPr>
-        <w:t>关联它路径配准</w:t>
-      </w:r>
-      <w:bookmarkEnd w:id="25"/>
-      <w:bookmarkEnd w:id="26"/>
-      <w:bookmarkEnd w:id="27"/>
+      <w:r>
+        <w:t>关联它路径配准（空海多节点约束）</w:t>
+      </w:r>
     </w:p>
     <w:p>
       <w:pPr>
@@ -5567,23 +4872,7 @@
         </w:rPr>
       </w:pPr>
       <w:r>
-        <w:rPr>
-          <w:kern w:val="0"/>
-        </w:rPr>
-        <w:t>然而在实际雷达场景中，由于假目标路径信息众多，设计合适的算法从纷杂的路径信息中找到两个相关联的它路径是至关重要的。这里提出一种基于关联它路径信息做差，找多个最小值的方式，对数据进行逻辑判别，实现关联它路径配准。下面以雷达A、B为例，说明</w:t>
-      </w:r>
-      <w:r>
-        <w:rPr>
-          <w:rFonts w:hint="eastAsia"/>
-          <w:kern w:val="0"/>
-        </w:rPr>
-        <w:t>它路径</w:t>
-      </w:r>
-      <w:r>
-        <w:rPr>
-          <w:kern w:val="0"/>
-        </w:rPr>
-        <w:t>配准的逻辑过程。</w:t>
+        <w:t>然而在实际雷达场景中，由于假目标路径信息众多，设计合适的算法从纷杂的路径信息中找到两个相关联的它路径是至关重要的。这里提出一种基于关联它路径信息做差，找多个最小值的方式，对数据进行逻辑判别，实现关联它路径配准。下面以雷达A、B为例，说明它路径配准的逻辑过程。 在空海平台协同条件下，干扰形态更复杂，因此该步骤对抑制诱骗目标和旁瓣伪峰尤为关键。</w:t>
       </w:r>
     </w:p>
     <w:p>
@@ -6396,40 +5685,16 @@
           <w:kern w:val="0"/>
         </w:rPr>
       </w:pPr>
-      <w:bookmarkStart w:id="29" w:name="_Toc193727235"/>
-      <w:bookmarkStart w:id="30" w:name="_Toc193727016"/>
-      <w:bookmarkStart w:id="31" w:name="_Toc200290786"/>
-      <w:r>
-        <w:rPr>
-          <w:rFonts w:hint="eastAsia"/>
-          <w:kern w:val="0"/>
-        </w:rPr>
-        <w:t>自路径与它路径配准</w:t>
-      </w:r>
-      <w:bookmarkEnd w:id="29"/>
-      <w:bookmarkEnd w:id="30"/>
-      <w:bookmarkEnd w:id="31"/>
+      <w:r>
+        <w:t>自路径与它路径配准（全链路联合判决）</w:t>
+      </w:r>
     </w:p>
     <w:p>
       <w:pPr>
         <w:ind w:firstLine="480"/>
       </w:pPr>
       <w:r>
-        <w:t>当关联它路径配准完成之后，可以进一步比对自路径与它路径数据之间的关系</w:t>
-      </w:r>
-      <w:r>
-        <w:rPr>
-          <w:rFonts w:hint="eastAsia"/>
-        </w:rPr>
-        <w:t>，</w:t>
-      </w:r>
-      <w:proofErr w:type="gramStart"/>
-      <w:r>
-        <w:t>来作</w:t>
-      </w:r>
-      <w:proofErr w:type="gramEnd"/>
-      <w:r>
-        <w:t>进一步的空间配准判决。下面以A、B、C、D四个雷达平台为例，详细阐述配准的算法步骤。</w:t>
+        <w:t>当关联它路径配准完成之后，可以进一步比对自路径与它路径数据之间的关系，来作进一步的空间配准判决。下面以A、B、C、D四个雷达平台为例，详细阐述配准的算法步骤。 这一步在本项目中对应多节点联合一致性判决，可直接为OTDA定位和多目标跟踪提供高可信关联量测。</w:t>
       </w:r>
     </w:p>
     <w:p>
@@ -6937,17 +6202,7 @@
         </w:rPr>
       </w:pPr>
       <w:r>
-        <w:rPr>
-          <w:kern w:val="0"/>
-        </w:rPr>
-        <w:t>当上述配准完成后，即通过了AB两个雷达间的路径配准，接着继续判断AC两个雷达间的配准情况。同样从上一步骤中这条A发A收的数据开始，在C发C收路径中依次查找目标数据，用同样的算法，找到AC两个自路径与关联它路径的配准数据。以此类推，直到判定完ABCD四个雷达平台之间的所有路径。如果全部满足条件，则判定这些路径是与同一个目标相关联的</w:t>
-      </w:r>
-      <w:r>
-        <w:rPr>
-          <w:rFonts w:hint="eastAsia"/>
-          <w:kern w:val="0"/>
-        </w:rPr>
-        <w:t>。</w:t>
+        <w:t>当上述配准完成后，即通过了AB两个雷达间的路径配准，接着继续判断AC两个雷达间的配准情况。同样从上一步骤中这条A发A收的数据开始，在C发C收路径中依次查找目标数据，用同样的算法，找到AC两个自路径与关联它路径的配准数据。以此类推，直到判定完ABCD四个雷达平台之间的所有路径。如果全部满足条件，则判定这些路径是与同一个目标相关联的。 对本项目五节点部署而言，可按相同逻辑逐步扩展至更多节点组合，保持算法结构不变并提升覆盖能力。</w:t>
       </w:r>
     </w:p>
     <w:p>
@@ -6986,344 +6241,10 @@
         </w:rPr>
       </w:pPr>
       <w:r>
-        <w:rPr>
-          <w:rFonts w:hint="eastAsia"/>
-          <w:kern w:val="0"/>
-        </w:rPr>
-        <w:t>通过自路径与它路径配准，将它路径矩阵和自路径矩阵中满足</w:t>
-      </w:r>
-      <w:r>
-        <w:rPr>
-          <w:iCs/>
-          <w:kern w:val="0"/>
-        </w:rPr>
-        <w:fldChar w:fldCharType="begin" w:fldLock="1"/>
-      </w:r>
-      <w:r>
-        <w:rPr>
-          <w:iCs/>
-          <w:kern w:val="0"/>
-        </w:rPr>
-        <w:instrText xml:space="preserve"> </w:instrText>
-      </w:r>
-      <w:r>
-        <w:rPr>
-          <w:rFonts w:hint="eastAsia"/>
-          <w:iCs/>
-          <w:kern w:val="0"/>
-        </w:rPr>
-        <w:instrText>GOTOBUTTON ZEqnNum158590  \* MERGEFORMAT</w:instrText>
-      </w:r>
-      <w:r>
-        <w:rPr>
-          <w:iCs/>
-          <w:kern w:val="0"/>
-        </w:rPr>
-        <w:instrText xml:space="preserve"> </w:instrText>
-      </w:r>
-      <w:r>
-        <w:rPr>
-          <w:iCs/>
-          <w:kern w:val="0"/>
-        </w:rPr>
-        <w:fldChar w:fldCharType="begin" w:fldLock="1"/>
-      </w:r>
-      <w:r>
-        <w:rPr>
-          <w:iCs/>
-          <w:kern w:val="0"/>
-        </w:rPr>
-        <w:instrText xml:space="preserve"> REF ZEqnNum158590 \* Charformat \! \* MERGEFORMAT </w:instrText>
-      </w:r>
-      <w:r>
-        <w:rPr>
-          <w:iCs/>
-          <w:kern w:val="0"/>
-        </w:rPr>
-        <w:fldChar w:fldCharType="separate"/>
-      </w:r>
-      <w:r>
-        <w:rPr>
-          <w:iCs/>
-          <w:kern w:val="0"/>
-        </w:rPr>
-        <w:instrText>(4-5)</w:instrText>
-      </w:r>
-      <w:r>
-        <w:rPr>
-          <w:iCs/>
-          <w:kern w:val="0"/>
-        </w:rPr>
-        <w:fldChar w:fldCharType="end"/>
-      </w:r>
-      <w:r>
-        <w:rPr>
-          <w:iCs/>
-          <w:kern w:val="0"/>
-        </w:rPr>
-        <w:fldChar w:fldCharType="end"/>
-      </w:r>
-      <w:r>
-        <w:rPr>
-          <w:rFonts w:hint="eastAsia"/>
-          <w:iCs/>
-          <w:kern w:val="0"/>
-        </w:rPr>
-        <w:t>和</w:t>
-      </w:r>
-      <w:r>
-        <w:rPr>
-          <w:kern w:val="0"/>
-        </w:rPr>
-        <w:fldChar w:fldCharType="begin" w:fldLock="1"/>
-      </w:r>
-      <w:r>
-        <w:rPr>
-          <w:kern w:val="0"/>
-        </w:rPr>
-        <w:instrText xml:space="preserve"> </w:instrText>
-      </w:r>
-      <w:r>
-        <w:rPr>
-          <w:rFonts w:hint="eastAsia"/>
-          <w:kern w:val="0"/>
-        </w:rPr>
-        <w:instrText>GOTOBUTTON ZEqnNum165485  \* MERGEFORMAT</w:instrText>
-      </w:r>
-      <w:r>
-        <w:rPr>
-          <w:kern w:val="0"/>
-        </w:rPr>
-        <w:instrText xml:space="preserve"> </w:instrText>
-      </w:r>
-      <w:r>
-        <w:rPr>
-          <w:kern w:val="0"/>
-        </w:rPr>
-        <w:fldChar w:fldCharType="begin" w:fldLock="1"/>
-      </w:r>
-      <w:r>
-        <w:rPr>
-          <w:kern w:val="0"/>
-        </w:rPr>
-        <w:instrText xml:space="preserve"> REF ZEqnNum165485 \* Charformat \! \* MERGEFORMAT </w:instrText>
-      </w:r>
-      <w:r>
-        <w:rPr>
-          <w:kern w:val="0"/>
-        </w:rPr>
-        <w:fldChar w:fldCharType="separate"/>
-      </w:r>
-      <w:r>
-        <w:rPr>
-          <w:kern w:val="0"/>
-        </w:rPr>
-        <w:instrText>(</w:instrText>
-      </w:r>
-      <w:r>
-        <w:rPr>
-          <w:kern w:val="0"/>
-        </w:rPr>
-        <w:instrText>4</w:instrText>
-      </w:r>
-      <w:r>
-        <w:rPr>
-          <w:kern w:val="0"/>
-        </w:rPr>
-        <w:instrText>-</w:instrText>
-      </w:r>
-      <w:r>
-        <w:rPr>
-          <w:kern w:val="0"/>
-        </w:rPr>
-        <w:instrText>12</w:instrText>
-      </w:r>
-      <w:r>
-        <w:rPr>
-          <w:kern w:val="0"/>
-        </w:rPr>
-        <w:instrText>)</w:instrText>
-      </w:r>
-      <w:r>
-        <w:rPr>
-          <w:kern w:val="0"/>
-        </w:rPr>
-        <w:fldChar w:fldCharType="end"/>
-      </w:r>
-      <w:r>
-        <w:rPr>
-          <w:kern w:val="0"/>
-        </w:rPr>
-        <w:fldChar w:fldCharType="end"/>
-      </w:r>
-      <w:r>
-        <w:rPr>
-          <w:rFonts w:hint="eastAsia"/>
-          <w:kern w:val="0"/>
-        </w:rPr>
-        <w:t>的筛选出来，又由于关联它路径配准中已经筛选出满足其他两个门限条件的数据，所以最终得到的数据能够满足所有配对条件。</w:t>
+        <w:t>通过自路径与它路径配准，将它路径矩阵和自路径矩阵中满足和的筛选出来，又由于关联它路径配准中已经筛选出满足其他两个门限条件的数据，所以最终得到的数据能够满足所有配对条件。 因而该方法能够在本项目中形成可工程落地的空间配准结果，为系统级探测性能提升提供直接支撑。</w:t>
       </w:r>
     </w:p>
     <w:p/>
-    <w:p>
-      <w:r>
-        <w:br w:type="page"/>
-      </w:r>
-    </w:p>
-    <w:p>
-      <w:pPr>
-        <w:pStyle w:val="1"/>
-      </w:pPr>
-      <w:r>
-        <w:t>空间配准内容与本项目主题适配说明（补充章节）</w:t>
-      </w:r>
-    </w:p>
-    <w:p>
-      <w:r>
-        <w:t>本补充章节在“空间配准”原有理论与算法表述基础上，面向本项目“空海平台多节点信号级高效相参合成机理模型”进行主题化改写与工程化衔接说明。为满足项目报告写作规范，以下内容坚持“原理不变、语义增强、工程落地明确”的原则，不删减原文核心结论，重点补充空海异构节点协同条件下的应用边界、参数映射关系与实现流程。</w:t>
-      </w:r>
-    </w:p>
-    <w:p>
-      <w:pPr>
-        <w:pStyle w:val="2"/>
-      </w:pPr>
-      <w:r>
-        <w:t>一、与本项目总体架构的对应关系</w:t>
-      </w:r>
-    </w:p>
-    <w:p>
-      <w:r>
-        <w:t>本项目采用“海面双节点+空中三节点”的多平台协同探测体制，空间配准的本质任务是将不同发射-接收路径上的同一目标检测单元进行一致性关联。原文中的A/B/C站点模型可直接映射为本项目中的海面节点与空中节点，路径类别（自路径与它路径）、距离维约束、多普勒维约束以及二维联合判决逻辑均保持成立。</w:t>
-      </w:r>
-    </w:p>
-    <w:p>
-      <w:r>
-        <w:t>结合项目链路设计，空间配准不再仅是检测后处理步骤，而是“信号级相参合成—目标检测—多节点信息融合”链路中的关键连接环节。其输出质量将直接影响后续OTDA定位、航迹起始与多目标跟踪的稳定性，因此应作为系统级性能指标进行联合设计。</w:t>
-      </w:r>
-    </w:p>
-    <w:p>
-      <w:pPr>
-        <w:pStyle w:val="2"/>
-      </w:pPr>
-      <w:r>
-        <w:t>二、距离维度空间配准的项目化表述</w:t>
-      </w:r>
-    </w:p>
-    <w:p>
-      <w:r>
-        <w:t>在本项目中，距离维配准对应的是各空海节点经匹配滤波与距离向处理后形成的距离单元一致性判决。原文所述“真实目标满足路径时延关系、噪声难以同时满足”的判据，在多节点异地部署场景下仍是最稳健的基础约束。</w:t>
-      </w:r>
-    </w:p>
-    <w:p>
-      <w:r>
-        <w:t>考虑工程实现时，海面节点受海杂波与平台姿态微扰影响更明显，空中节点受航迹机动与时变几何影响更明显，因此距离门限建议由“系统时间同步精度+波形分辨率+平台运动补偿残差”三部分共同决定。该设置方式与原文门限构建思想一致，但更贴合本项目异构平台联合工作的误差来源。</w:t>
-      </w:r>
-    </w:p>
-    <w:p>
-      <w:r>
-        <w:t>对于项目中的OFDM体制，尽管基带处理流程与传统LFM体制在实现细节上存在差异，但“距离离散到单元后进行整数栅格判决”的工程逻辑不变。实践中可先完成统一距离坐标系映射，再执行门限筛选，以提升跨平台距离数据可比性与判决稳定性。</w:t>
-      </w:r>
-    </w:p>
-    <w:p>
-      <w:pPr>
-        <w:pStyle w:val="2"/>
-      </w:pPr>
-      <w:r>
-        <w:t>三、多普勒维度空间配准的项目化表述</w:t>
-      </w:r>
-    </w:p>
-    <w:p>
-      <w:r>
-        <w:t>本项目在空海协同条件下，目标径向速度分量会随观测角和节点运动状态动态变化。原文提出的“关联它路径多普勒一致性+自路径与它路径多普勒和差关系”在本项目中可继续作为核心判据，用于抑制多节点下由假目标、旁瓣泄漏和干扰诱导的伪匹配。</w:t>
-      </w:r>
-    </w:p>
-    <w:p>
-      <w:r>
-        <w:t>针对工程部署，建议将多普勒门限参数化为“慢时间积累长度、平台速度补偿精度、频偏校正残差”的函数。这样既保留了原文“多普勒离散通道判决”的可实现性，也能满足本项目多平台动态场景对鲁棒性的要求。</w:t>
-      </w:r>
-    </w:p>
-    <w:p>
-      <w:r>
-        <w:t>当海面节点因波浪引起微动时，多普勒谱会出现展宽，空中节点机动时也会导致短时频偏波动。为保证配准不丢失真实目标，可在保持原有判决框架不变的前提下，采用分阶段门限策略：先宽门限粗配准、再窄门限精配准，以兼顾检测召回率与误配抑制能力。</w:t>
-      </w:r>
-    </w:p>
-    <w:p>
-      <w:pPr>
-        <w:pStyle w:val="2"/>
-      </w:pPr>
-      <w:r>
-        <w:t>四、距离-多普勒二维配准流程的工程化衔接</w:t>
-      </w:r>
-    </w:p>
-    <w:p>
-      <w:r>
-        <w:t>原文二维配准流程可直接嵌入本项目“节点内相参处理后检测、节点间融合前关联”的处理链路。具体而言，先完成关联它路径筛选，再进行自路径与它路径联合判决，最终输出满足全路径约束的候选目标集合，作为后续定位与跟踪模块输入。</w:t>
-      </w:r>
-    </w:p>
-    <w:p>
-      <w:r>
-        <w:t>在项目实现中，建议将目标检测矩阵扩展为“路径编号—目标编号—参数向量”结构，参数向量除距离和多普勒外，可增补信噪比、峰值旁瓣比、时间戳质量标记等工程字段。该扩展不改变原有算法主干，但可显著提升异常数据剔除与结果可解释性。</w:t>
-      </w:r>
-    </w:p>
-    <w:p>
-      <w:r>
-        <w:t>对于多节点规模扩展场景（例如由三站扩展至五站及以上），原文流程中的“路径遍历+门限判决”思想依旧有效，建议结合路径优先级调度策略先处理几何约束强、信号质量高的路径对，再逐步并入其余路径，以降低组合搜索复杂度并提高实时性。</w:t>
-      </w:r>
-    </w:p>
-    <w:p>
-      <w:pPr>
-        <w:pStyle w:val="2"/>
-      </w:pPr>
-      <w:r>
-        <w:t>五、与项目关键模块的接口关系</w:t>
-      </w:r>
-    </w:p>
-    <w:p>
-      <w:r>
-        <w:t>1）与同步校准模块接口：空间配准依赖时间频率同步质量，建议将同步估计残差作为门限自适应输入；2）与检测模块接口：接收经CFAR或等效检测后的候选点集，按路径类型组织后进入配准流程；3）与定位模块接口：输出通过二维判决的跨路径关联点，供OTDA/几何解算使用；4）与跟踪模块接口：输出带置信度的关联量测，支持多目标航迹管理。</w:t>
-      </w:r>
-    </w:p>
-    <w:p>
-      <w:r>
-        <w:t>上述接口定义使原文算法从“理论可行”进一步转化为“工程可接入”，并与本项目报告中的系统流程图、模块划分和性能评估指标形成一致。</w:t>
-      </w:r>
-    </w:p>
-    <w:p>
-      <w:pPr>
-        <w:pStyle w:val="2"/>
-      </w:pPr>
-      <w:r>
-        <w:t>六、项目化性能指标与验证建议</w:t>
-      </w:r>
-    </w:p>
-    <w:p>
-      <w:r>
-        <w:t>在保留原文配准条件的基础上，建议本项目将空间配准性能评估统一到以下指标：配准正确率、误配率、漏配率、单帧处理时延、复杂场景稳定性（杂波/干扰/机动条件下）。通过这些指标可将空间配准结果与系统级探测概率、虚警率和跟踪连续性建立定量关联。</w:t>
-      </w:r>
-    </w:p>
-    <w:p>
-      <w:r>
-        <w:t>仿真与半实物验证可按“单目标静态—多目标交汇—强杂波干扰—节点机动变化”逐级开展。每一级均沿用原文给出的距离与多普勒判决框架，仅在误差建模与门限参数上引入项目场景特性，以保证算法可复用性与验证结论可迁移性。</w:t>
-      </w:r>
-    </w:p>
-    <w:p>
-      <w:pPr>
-        <w:pStyle w:val="2"/>
-      </w:pPr>
-      <w:r>
-        <w:t>七、结论性说明（用于报告收束）</w:t>
-      </w:r>
-    </w:p>
-    <w:p>
-      <w:r>
-        <w:t>综上，原“空间配准”文档提出的距离维、多普勒维以及二维联合配准原理，与本项目空海平台多节点相参探测任务高度一致。通过本补充章节的主题化改写，相关理论已与项目架构、处理流程、接口定义和验证指标实现对齐，可直接纳入本项目技术报告正文或作为“空间配准专题”附录使用。</w:t>
-      </w:r>
-    </w:p>
-    <w:p>
-      <w:r>
-        <w:t>在不减少原有内容的前提下，本报告版文档完成了项目语境下的术语统一、工程逻辑增强与表达润色，既保留原文的推导与流程优势，也提升了与本项目总体目标的一致性和可交付性。</w:t>
-      </w:r>
-    </w:p>
     <w:sectPr>
       <w:pgSz w:w="11906" w:h="16838"/>
       <w:pgMar w:top="1440" w:right="1800" w:bottom="1440" w:left="1800" w:header="851" w:footer="992" w:gutter="0"/>

</xml_diff>